<commit_message>
opraveno na Maven, udelany testy JUnit
</commit_message>
<xml_diff>
--- a/Dokumentace-jm-escape.docx
+++ b/Dokumentace-jm-escape.docx
@@ -239,7 +239,7 @@
     </w:p>
     <w:p>
       <w:r>
-        <w:t>Projekt vyžaduje JDK 17 nebo novější. Nepoužívá žádné externí knihovny ani frameworky; využívá standardní knihovny Javy (např. java.io, java.nio.file, java.util). Zdrojové soubory jsou v balíčku cz.vse.escape. Dodaný archiv obsahuje zdrojové kódy a README.md; samostatný sestavovací soubor typu Maven/Gradle v archivu není.</w:t>
+        <w:t>Projekt vyžaduje JDK 17 nebo novější a Maven 3.8+. Jediná externí závislost je JUnit 5 (pouze pro testy, rozsah test); samotná hra využívá jen standardní knihovny Javy (např. java.io, java.nio.file, java.util). Zdrojové soubory jsou v balíčku cz.vse.escape. Projekt se sestavuje pomocí Maven (soubor pom.xml): mvn package.</w:t>
       </w:r>
     </w:p>
     <w:p>
@@ -250,13 +250,7 @@
         </w:rPr>
       </w:pPr>
       <w:r>
-        <w:t>Rozhraní aplikace je konzolové: GameConsole abstrahuje vstup a výstup a StandardGameConsole pracuje se System.in/System.out v UTF-8. Testy používají vlastní ScriptedConsole a spouštějí se třídou WalkthroughTest bez externího testovacího frameworku.</w:t>
-      </w:r>
-      <w:r>
-        <w:t xml:space="preserve"> </w:t>
-      </w:r>
-      <w:r>
-        <w:t>Součástí testů je i kontrola ASCII portrétů.</w:t>
+        <w:t>Rozhraní aplikace je konzolové: GameConsole abstrahuje vstup a výstup a StandardGameConsole pracuje se System.in/System.out v UTF-8. Testy (JUnit 5, třída GameScenariosTest) používají vlastní ScriptedConsole a spouštějí se příkazem mvn test. Součástí testů je i kontrola ASCII portrétů a ošetření poškozeného souboru s uloženou hrou.</w:t>
       </w:r>
     </w:p>
     <w:p>
@@ -313,7 +307,7 @@
     </w:p>
     <w:p>
       <w:r>
-        <w:t xml:space="preserve">Požadavky: JDK 17 nebo novější. </w:t>
+        <w:t>Požadavky: JDK 17 nebo novější, Maven 3.8+.</w:t>
       </w:r>
     </w:p>
     <w:p>
@@ -323,19 +317,7 @@
     </w:p>
     <w:p>
       <w:r>
-        <w:t>Spuštění: Otevřete projekt buď v IDE podporující práci s jazykem Java, nebo si projekt otevřete v konzoli v adresáři src</w:t>
-      </w:r>
-      <w:r>
-        <w:rPr>
-          <w:lang w:val="en-US"/>
-        </w:rPr>
-        <w:t>\main\java\cz.vse.escape a spus</w:t>
-      </w:r>
-      <w:r>
-        <w:t>ťte program pomocí příkazu: java Main.java</w:t>
-      </w:r>
-      <w:r>
-        <w:br w:type="page"/>
+        <w:t>Sestavení a spuštění: v kořenovém adresáři projektu (kde je pom.xml a složka ascii) spusťte mvn package a poté java -Dfile.encoding=UTF-8 -jar target/jm-escape-1.0.jar. Alternativně lze projekt otevřít v IDE a spustit třídu cz.vse.escape.Main s pracovním adresářem nastaveným na kořen projektu. Testy: mvn test.</w:t>
       </w:r>
     </w:p>
     <w:p>
@@ -401,7 +383,7 @@
     </w:p>
     <w:p>
       <w:r>
-        <w:t>běžný počítač nebo notebook schopný provozovat JDK 17+. Je potřeba operační systém s konzolí nebo Java IDE. Speciální hardware, databáze ani další služby nejsou požadovány. Pro testy není potřeba externí testovací knihovna.</w:t>
+        <w:t>běžný počítač nebo notebook schopný provozovat JDK 17+. Je potřeba operační systém s konzolí nebo Java IDE. Speciální hardware, databáze ani další služby nejsou požadovány. Testovací knihovna JUnit 5 se stáhne automaticky přes Maven.</w:t>
       </w:r>
     </w:p>
     <w:p/>

</xml_diff>